<commit_message>
fixed figure captions (colours)
</commit_message>
<xml_diff>
--- a/revision_material/MEE-26-04-325_Response_to_Reviewers.docx
+++ b/revision_material/MEE-26-04-325_Response_to_Reviewers.docx
@@ -1710,7 +1710,7 @@
         <w:t xml:space="preserve">Response: </w:t>
       </w:r>
       <w:r>
-        <w:t xml:space="preserve">We have corrected the figure colour scheme so that point estimates (purple) and sampling-distribution/uncertainty-aware summaries (green) are distinguished consistently across all main and supplementary figures, and the captions have been revised to match the plotted colours and symbols.</w:t>
+        <w:t xml:space="preserve">We have corrected the captions to match the plotted colours and symbols. In the two-model comparisons, purple denotes the point-estimate model and green the model with sampling uncertainty. Figures 1 and 2 instead use pale green distributions and teal dashed point-estimate lines; their captions now describe this correctly and no longer refer to red lines or grey posterior-median lines that are not plotted. We also removed the redundant legends in Figure 4 to improve readability without changing its colours.</w:t>
       </w:r>
     </w:p>
     <w:p>
@@ -1742,7 +1742,7 @@
         <w:t xml:space="preserve">Response: </w:t>
       </w:r>
       <w:r>
-        <w:t xml:space="preserve">We have revised the Figure 4 caption so that the take-home message appears at the beginning, consistent with the other captions: it now states upfront that accounting for sampling uncertainty strengthens support for a positive life expectancy–shape relationship by shrinking and shifting the population-level estimates that drive the regression.</w:t>
+        <w:t xml:space="preserve">We have revised the Figure 4 caption so that the take-home message appears at the beginning: “Accounting for sampling uncertainty shifts the estimated life expectancy-shape relationship and narrows its posterior interval, although both models retain substantial uncertainty about the direction of the relationship.” This distinguishes the change in the estimates from the evidence about the direction of the relationship.</w:t>
       </w:r>
     </w:p>
     <w:p>

</xml_diff>

<commit_message>
Strength of mechanistic and robustness claims
</commit_message>
<xml_diff>
--- a/revision_material/MEE-26-04-325_Response_to_Reviewers.docx
+++ b/revision_material/MEE-26-04-325_Response_to_Reviewers.docx
@@ -382,7 +382,7 @@
         <w:t xml:space="preserve">Response: </w:t>
       </w:r>
       <w:r>
-        <w:t xml:space="preserve">We have added an explicit analysis of displacement magnitude in Analysis 1. For each population-level matrix, we quantified displacement as the absolute difference between the point estimate and the median of the sampling distribution (for mature life expectancy, on the log10 scale), and related this to (i) the number of boundary survival stages and (ii) the proportion of sampled individuals in boundary-survival stages. Both predictors were positively associated with displacement magnitude for both shape and life expectancy, providing direct quantitative support for the proposed mechanism. These results are reported in a new Supplementary Methods subsection and Supplementary Results subsection, with a new figure and table (Figure S3; Table S13). [main text ll. XX–YY]</w:t>
+        <w:t xml:space="preserve">We have added an explicit analysis of displacement magnitude in Analysis 1. For each population-level matrix, we quantified displacement as the absolute difference between the point estimate and the median of the sampling distribution (for mature life expectancy, on the log10 scale), and related this to (i) the number of boundary survival stages and (ii) the proportion of sampled individuals in boundary-survival stages. Both predictors were positively associated with displacement magnitude for both shape and life expectancy, consistent with the proposed mechanism but not establishing causality. These results are reported in a new Supplementary Methods subsection and Supplementary Results subsection, with a new figure and table (Figure S3; Table S13). [main text ll. XX–YY]</w:t>
       </w:r>
     </w:p>
     <w:p>
@@ -478,7 +478,7 @@
         <w:t xml:space="preserve">Response: </w:t>
       </w:r>
       <w:r>
-        <w:t xml:space="preserve">We have qualified the checklist accordingly. The thresholds are now presented explicitly as heuristics derived from a restricted and taxonomically narrow dataset of largely herbaceous perennials that are unlikely to apply universally, rather than as formally validated decision rules, and we have softened the corresponding claims about the robustness of integrated metrics such as λ. [ll. XX–YY]</w:t>
+        <w:t xml:space="preserve">We now present the thresholds as provisional screening heuristics informed by our restricted dataset, not validated decision rules. We also limit claims of lower sensitivity for integrated metrics to the dataset analysed and explicitly state that the proposed favourable conditions do not guarantee robustness. [ll. XX–YY]</w:t>
       </w:r>
     </w:p>
     <w:p>
@@ -588,7 +588,7 @@
         <w:t xml:space="preserve">Response: </w:t>
       </w:r>
       <w:r>
-        <w:t xml:space="preserve">We added a sensitivity analysis for the quasi-stable-distribution truncation threshold used in the shape calculation. Recomputing shape at 0.5% and 5% thresholds showed very high concordance with the 1% threshold used in the main analysis, with only small median shifts in shape and only two sign changes, both for estimates already close to zero. We now report this in Supplementary Methods S1.13, Supplementary Results S2.4, Table S14, and Figure S4.</w:t>
+        <w:t xml:space="preserve">We added a sensitivity analysis for the quasi-stable-distribution truncation threshold used in the shape calculation. Recomputing shape at 0.5% and 5% thresholds showed very high concordance with the 1% threshold used in the main analysis, with only small median shifts in shape and only two sign changes, both for estimates already close to zero. This check concerns shape estimates only; downstream regressions were not refitted, and we now state this limitation explicitly. We report the check in Supplementary Methods S1.13, Supplementary Results S2.4, Table S14, and Figure S4.</w:t>
       </w:r>
     </w:p>
     <w:p>

</xml_diff>

<commit_message>
Fixed terminology (bootstrapping/posterior sampling)
</commit_message>
<xml_diff>
--- a/revision_material/MEE-26-04-325_Response_to_Reviewers.docx
+++ b/revision_material/MEE-26-04-325_Response_to_Reviewers.docx
@@ -854,7 +854,7 @@
         <w:t xml:space="preserve">Response: </w:t>
       </w:r>
       <w:r>
-        <w:t xml:space="preserve">We have made the uncertainty-propagation methods more prominent. The ‘Sampling distribution for a single MPM’ section now sets out the likelihood-based parametric bootstrap explicitly, and each analysis states which quantity carries the propagated uncertainty and how it enters the statistical model. [ll. XX–YY]</w:t>
+        <w:t xml:space="preserve">We have made the uncertainty-propagation methods more prominent. The ‘Sampling distribution for a single MPM’ section now describes direct conjugate posterior sampling, including the priors, draw counts and treatment of zero entries and unavailable sample sizes, and each analysis states which quantity carries the propagated uncertainty and how it enters the statistical model. [ll. XX–YY]</w:t>
       </w:r>
     </w:p>
     <w:p>
@@ -1092,7 +1092,7 @@
         <w:t xml:space="preserve">Response: </w:t>
       </w:r>
       <w:r>
-        <w:t xml:space="preserve">We have now reported this explicitly: “Across the compiled analysis set, 5 population-level matrices (representing 5 populations) had no usable recovered stage-specific sample sizes at all and therefore could not contribute to uncertainty-propagation analyses that require reconstructed sampling distributions.” [ll. XX–YY]</w:t>
+        <w:t xml:space="preserve">We have now reported this explicitly: “Across the compiled analysis set, 5 population-level matrices (representing 5 populations) had no usable recovered stage-specific sample sizes. Where retained, their unsupported columns were held fixed rather than assigned reconstructed sampling uncertainty.” [ll. XX–YY]</w:t>
       </w:r>
     </w:p>
     <w:p>
@@ -1156,7 +1156,7 @@
         <w:t xml:space="preserve">Response: </w:t>
       </w:r>
       <w:r>
-        <w:t xml:space="preserve">We agree it was unclear, and have clarified it in the Methods. The revised text explains that the extra row (d) represents death as the complementary non-survival outcome for each origin stage, and states that, in the implemented bootstrap, death is resampled jointly with the living transitions in each U-column, but only the living-stage components are written back into the simulated U matrix. [ll. XX–YY]</w:t>
+        <w:t xml:space="preserve">We agree it was unclear, and have clarified it in the Methods. The revised text explains that the extra row (d) represents death as the complementary non-survival outcome for each origin stage, and states that, in the posterior sampling, death probability is drawn jointly with the living-transition probabilities in each U-column, but only the living-stage components are written back into the simulated U matrix. [ll. XX–YY]</w:t>
       </w:r>
     </w:p>
     <w:p>

</xml_diff>